<commit_message>
court(mo sc): amicus-brief latex_bias 0.1 (p12 line 17 now breaks as typst); still reported for the quoted list on p16 and Word's footnote area (fb-595.54.59)
Co-Authored-By: Claude Opus 5.5 <noreply@anthropic.com>
</commit_message>
<xml_diff>
--- a/courts/eighth-circuit/missouri/state/supreme-court/amicus-brief/usage/OUTPUT-amicus-brief.docx
+++ b/courts/eighth-circuit/missouri/state/supreme-court/amicus-brief/usage/OUTPUT-amicus-brief.docx
@@ -1735,7 +1735,7 @@
         <w:tab/>
       </w:r>
       <w:r>
-        <w:t xml:space="preserve">22, 23</w:t>
+        <w:t xml:space="preserve">22, 23, 24</w:t>
       </w:r>
     </w:p>
     <w:p>
@@ -2433,7 +2433,7 @@
         <w:tab/>
       </w:r>
       <w:r>
-        <w:t xml:space="preserve">8</w:t>
+        <w:t xml:space="preserve">8, 10</w:t>
       </w:r>
     </w:p>
     <w:p>
@@ -2717,7 +2717,7 @@
         <w:tab/>
       </w:r>
       <w:r>
-        <w:t xml:space="preserve">7, 15</w:t>
+        <w:t xml:space="preserve">7, 15, 16</w:t>
       </w:r>
     </w:p>
     <w:p>
@@ -3183,7 +3183,7 @@
         <w:tab/>
       </w:r>
       <w:r>
-        <w:t xml:space="preserve">18</w:t>
+        <w:t xml:space="preserve">18, 21, 22</w:t>
       </w:r>
     </w:p>
     <w:p>
@@ -3245,7 +3245,7 @@
           <w:tab w:val="right" w:leader="dot" w:pos="9360"/>
         </w:tabs>
         <w:spacing w:before="104" w:after="0" w:line="299" w:lineRule="exact"/>
-        <w:ind w:left="720" w:right="1120" w:hanging="720"/>
+        <w:ind w:left="720" w:right="1430" w:hanging="720"/>
       </w:pPr>
       <w:r>
         <w:t xml:space="preserve">Mo.</w:t>
@@ -3287,7 +3287,7 @@
         <w:tab/>
       </w:r>
       <w:r>
-        <w:t xml:space="preserve">18, 20, 25</w:t>
+        <w:t xml:space="preserve">18, 20, 21, 25</w:t>
       </w:r>
     </w:p>
     <w:p>

</xml_diff>